<commit_message>
Added a couple lines to Task 2
</commit_message>
<xml_diff>
--- a/Web Design Summary.docx
+++ b/Web Design Summary.docx
@@ -7,7 +7,7 @@
         <w:pStyle w:val="Title"/>
         <w:rPr/>
       </w:pPr>
-      <w:bookmarkStart w:colFirst="0" w:colLast="0" w:name="_o4a16ywtwrz8" w:id="0"/>
+      <w:bookmarkStart w:colFirst="0" w:colLast="0" w:name="_heading=h.iq3irrix1bug" w:id="0"/>
       <w:bookmarkEnd w:id="0"/>
       <w:r>
         <w:rPr>
@@ -43,7 +43,7 @@
         </w:rPr>
         <w:t xml:space="preserve">Link to website: </w:t>
       </w:r>
-      <w:hyperlink r:id="rId6">
+      <w:hyperlink r:id="rId7">
         <w:r>
           <w:rPr>
             <w:color w:val="1155cc"/>
@@ -91,7 +91,7 @@
           <w:u w:val="single"/>
         </w:rPr>
       </w:pPr>
-      <w:bookmarkStart w:colFirst="0" w:colLast="0" w:name="_t156q53neb6j" w:id="1"/>
+      <w:bookmarkStart w:colFirst="0" w:colLast="0" w:name="_heading=h.kbg0za5uxsvc" w:id="1"/>
       <w:bookmarkEnd w:id="1"/>
       <w:r>
         <w:rPr>
@@ -106,7 +106,7 @@
           <w:u w:val="single"/>
         </w:rPr>
       </w:pPr>
-      <w:bookmarkStart w:colFirst="0" w:colLast="0" w:name="_ctcr9lplijd5" w:id="2"/>
+      <w:bookmarkStart w:colFirst="0" w:colLast="0" w:name="_heading=h.dv1b81e3djke" w:id="2"/>
       <w:bookmarkEnd w:id="2"/>
       <w:r>
         <w:rPr>
@@ -126,16 +126,16 @@
           <wp:inline distB="114300" distT="114300" distL="114300" distR="114300">
             <wp:extent cx="5314950" cy="4600575"/>
             <wp:effectExtent b="0" l="0" r="0" t="0"/>
-            <wp:docPr id="3" name="image7.png"/>
+            <wp:docPr id="15" name="image8.png"/>
             <a:graphic>
               <a:graphicData uri="http://schemas.openxmlformats.org/drawingml/2006/picture">
                 <pic:pic>
                   <pic:nvPicPr>
-                    <pic:cNvPr id="0" name="image7.png"/>
+                    <pic:cNvPr id="0" name="image8.png"/>
                     <pic:cNvPicPr preferRelativeResize="0"/>
                   </pic:nvPicPr>
                   <pic:blipFill>
-                    <a:blip r:embed="rId7"/>
+                    <a:blip r:embed="rId8"/>
                     <a:srcRect b="0" l="0" r="0" t="0"/>
                     <a:stretch>
                       <a:fillRect/>
@@ -161,16 +161,16 @@
           <wp:inline distB="114300" distT="114300" distL="114300" distR="114300">
             <wp:extent cx="5943600" cy="3352800"/>
             <wp:effectExtent b="0" l="0" r="0" t="0"/>
-            <wp:docPr id="10" name="image14.png"/>
+            <wp:docPr id="17" name="image7.png"/>
             <a:graphic>
               <a:graphicData uri="http://schemas.openxmlformats.org/drawingml/2006/picture">
                 <pic:pic>
                   <pic:nvPicPr>
-                    <pic:cNvPr id="0" name="image14.png"/>
+                    <pic:cNvPr id="0" name="image7.png"/>
                     <pic:cNvPicPr preferRelativeResize="0"/>
                   </pic:nvPicPr>
                   <pic:blipFill>
-                    <a:blip r:embed="rId8"/>
+                    <a:blip r:embed="rId9"/>
                     <a:srcRect b="0" l="0" r="0" t="0"/>
                     <a:stretch>
                       <a:fillRect/>
@@ -196,16 +196,16 @@
           <wp:inline distB="114300" distT="114300" distL="114300" distR="114300">
             <wp:extent cx="5314950" cy="5095875"/>
             <wp:effectExtent b="0" l="0" r="0" t="0"/>
-            <wp:docPr id="2" name="image3.png"/>
+            <wp:docPr id="16" name="image13.png"/>
             <a:graphic>
               <a:graphicData uri="http://schemas.openxmlformats.org/drawingml/2006/picture">
                 <pic:pic>
                   <pic:nvPicPr>
-                    <pic:cNvPr id="0" name="image3.png"/>
+                    <pic:cNvPr id="0" name="image13.png"/>
                     <pic:cNvPicPr preferRelativeResize="0"/>
                   </pic:nvPicPr>
                   <pic:blipFill>
-                    <a:blip r:embed="rId9"/>
+                    <a:blip r:embed="rId10"/>
                     <a:srcRect b="0" l="0" r="0" t="0"/>
                     <a:stretch>
                       <a:fillRect/>
@@ -231,16 +231,16 @@
           <wp:inline distB="114300" distT="114300" distL="114300" distR="114300">
             <wp:extent cx="5314950" cy="3905250"/>
             <wp:effectExtent b="0" l="0" r="0" t="0"/>
-            <wp:docPr id="9" name="image9.png"/>
+            <wp:docPr id="19" name="image6.png"/>
             <a:graphic>
               <a:graphicData uri="http://schemas.openxmlformats.org/drawingml/2006/picture">
                 <pic:pic>
                   <pic:nvPicPr>
-                    <pic:cNvPr id="0" name="image9.png"/>
+                    <pic:cNvPr id="0" name="image6.png"/>
                     <pic:cNvPicPr preferRelativeResize="0"/>
                   </pic:nvPicPr>
                   <pic:blipFill>
-                    <a:blip r:embed="rId10"/>
+                    <a:blip r:embed="rId11"/>
                     <a:srcRect b="0" l="0" r="0" t="0"/>
                     <a:stretch>
                       <a:fillRect/>
@@ -266,16 +266,16 @@
           <wp:inline distB="114300" distT="114300" distL="114300" distR="114300">
             <wp:extent cx="5314950" cy="3600450"/>
             <wp:effectExtent b="0" l="0" r="0" t="0"/>
-            <wp:docPr id="13" name="image10.png"/>
+            <wp:docPr id="18" name="image11.png"/>
             <a:graphic>
               <a:graphicData uri="http://schemas.openxmlformats.org/drawingml/2006/picture">
                 <pic:pic>
                   <pic:nvPicPr>
-                    <pic:cNvPr id="0" name="image10.png"/>
+                    <pic:cNvPr id="0" name="image11.png"/>
                     <pic:cNvPicPr preferRelativeResize="0"/>
                   </pic:nvPicPr>
                   <pic:blipFill>
-                    <a:blip r:embed="rId11"/>
+                    <a:blip r:embed="rId12"/>
                     <a:srcRect b="0" l="0" r="0" t="0"/>
                     <a:stretch>
                       <a:fillRect/>
@@ -301,16 +301,16 @@
           <wp:inline distB="114300" distT="114300" distL="114300" distR="114300">
             <wp:extent cx="5314950" cy="4219575"/>
             <wp:effectExtent b="0" l="0" r="0" t="0"/>
-            <wp:docPr id="1" name="image2.png"/>
+            <wp:docPr id="21" name="image9.png"/>
             <a:graphic>
               <a:graphicData uri="http://schemas.openxmlformats.org/drawingml/2006/picture">
                 <pic:pic>
                   <pic:nvPicPr>
-                    <pic:cNvPr id="0" name="image2.png"/>
+                    <pic:cNvPr id="0" name="image9.png"/>
                     <pic:cNvPicPr preferRelativeResize="0"/>
                   </pic:nvPicPr>
                   <pic:blipFill>
-                    <a:blip r:embed="rId12"/>
+                    <a:blip r:embed="rId13"/>
                     <a:srcRect b="0" l="0" r="0" t="0"/>
                     <a:stretch>
                       <a:fillRect/>
@@ -336,16 +336,16 @@
           <wp:inline distB="114300" distT="114300" distL="114300" distR="114300">
             <wp:extent cx="5276850" cy="3743325"/>
             <wp:effectExtent b="0" l="0" r="0" t="0"/>
-            <wp:docPr id="4" name="image4.png"/>
+            <wp:docPr id="20" name="image12.png"/>
             <a:graphic>
               <a:graphicData uri="http://schemas.openxmlformats.org/drawingml/2006/picture">
                 <pic:pic>
                   <pic:nvPicPr>
-                    <pic:cNvPr id="0" name="image4.png"/>
+                    <pic:cNvPr id="0" name="image12.png"/>
                     <pic:cNvPicPr preferRelativeResize="0"/>
                   </pic:nvPicPr>
                   <pic:blipFill>
-                    <a:blip r:embed="rId13"/>
+                    <a:blip r:embed="rId14"/>
                     <a:srcRect b="0" l="0" r="0" t="0"/>
                     <a:stretch>
                       <a:fillRect/>
@@ -371,16 +371,16 @@
           <wp:inline distB="114300" distT="114300" distL="114300" distR="114300">
             <wp:extent cx="5276850" cy="4914900"/>
             <wp:effectExtent b="0" l="0" r="0" t="0"/>
-            <wp:docPr id="6" name="image1.png"/>
+            <wp:docPr id="23" name="image2.png"/>
             <a:graphic>
               <a:graphicData uri="http://schemas.openxmlformats.org/drawingml/2006/picture">
                 <pic:pic>
                   <pic:nvPicPr>
-                    <pic:cNvPr id="0" name="image1.png"/>
+                    <pic:cNvPr id="0" name="image2.png"/>
                     <pic:cNvPicPr preferRelativeResize="0"/>
                   </pic:nvPicPr>
                   <pic:blipFill>
-                    <a:blip r:embed="rId14"/>
+                    <a:blip r:embed="rId15"/>
                     <a:srcRect b="0" l="0" r="0" t="0"/>
                     <a:stretch>
                       <a:fillRect/>
@@ -406,16 +406,16 @@
           <wp:inline distB="114300" distT="114300" distL="114300" distR="114300">
             <wp:extent cx="5276850" cy="4248150"/>
             <wp:effectExtent b="0" l="0" r="0" t="0"/>
-            <wp:docPr id="8" name="image5.png"/>
+            <wp:docPr id="22" name="image1.png"/>
             <a:graphic>
               <a:graphicData uri="http://schemas.openxmlformats.org/drawingml/2006/picture">
                 <pic:pic>
                   <pic:nvPicPr>
-                    <pic:cNvPr id="0" name="image5.png"/>
+                    <pic:cNvPr id="0" name="image1.png"/>
                     <pic:cNvPicPr preferRelativeResize="0"/>
                   </pic:nvPicPr>
                   <pic:blipFill>
-                    <a:blip r:embed="rId15"/>
+                    <a:blip r:embed="rId16"/>
                     <a:srcRect b="0" l="0" r="0" t="0"/>
                     <a:stretch>
                       <a:fillRect/>
@@ -441,16 +441,16 @@
           <wp:inline distB="114300" distT="114300" distL="114300" distR="114300">
             <wp:extent cx="5276850" cy="5610225"/>
             <wp:effectExtent b="0" l="0" r="0" t="0"/>
-            <wp:docPr id="14" name="image8.png"/>
+            <wp:docPr id="26" name="image4.png"/>
             <a:graphic>
               <a:graphicData uri="http://schemas.openxmlformats.org/drawingml/2006/picture">
                 <pic:pic>
                   <pic:nvPicPr>
-                    <pic:cNvPr id="0" name="image8.png"/>
+                    <pic:cNvPr id="0" name="image4.png"/>
                     <pic:cNvPicPr preferRelativeResize="0"/>
                   </pic:nvPicPr>
                   <pic:blipFill>
-                    <a:blip r:embed="rId16"/>
+                    <a:blip r:embed="rId17"/>
                     <a:srcRect b="0" l="0" r="0" t="0"/>
                     <a:stretch>
                       <a:fillRect/>
@@ -476,16 +476,16 @@
           <wp:inline distB="114300" distT="114300" distL="114300" distR="114300">
             <wp:extent cx="5276850" cy="4762500"/>
             <wp:effectExtent b="0" l="0" r="0" t="0"/>
-            <wp:docPr id="5" name="image11.png"/>
+            <wp:docPr id="24" name="image5.png"/>
             <a:graphic>
               <a:graphicData uri="http://schemas.openxmlformats.org/drawingml/2006/picture">
                 <pic:pic>
                   <pic:nvPicPr>
-                    <pic:cNvPr id="0" name="image11.png"/>
+                    <pic:cNvPr id="0" name="image5.png"/>
                     <pic:cNvPicPr preferRelativeResize="0"/>
                   </pic:nvPicPr>
                   <pic:blipFill>
-                    <a:blip r:embed="rId17"/>
+                    <a:blip r:embed="rId18"/>
                     <a:srcRect b="0" l="0" r="0" t="0"/>
                     <a:stretch>
                       <a:fillRect/>
@@ -526,7 +526,7 @@
         <w:pStyle w:val="Heading2"/>
         <w:rPr/>
       </w:pPr>
-      <w:bookmarkStart w:colFirst="0" w:colLast="0" w:name="_ik1naoiie6mv" w:id="3"/>
+      <w:bookmarkStart w:colFirst="0" w:colLast="0" w:name="_heading=h.wv8x6pt36s5e" w:id="3"/>
       <w:bookmarkEnd w:id="3"/>
       <w:r>
         <w:rPr>
@@ -539,7 +539,7 @@
         <w:pStyle w:val="Heading2"/>
         <w:rPr/>
       </w:pPr>
-      <w:bookmarkStart w:colFirst="0" w:colLast="0" w:name="_177kioa3o9c7" w:id="4"/>
+      <w:bookmarkStart w:colFirst="0" w:colLast="0" w:name="_heading=h.67rjdmsp1opn" w:id="4"/>
       <w:bookmarkEnd w:id="4"/>
       <w:r>
         <w:rPr>
@@ -600,7 +600,7 @@
           <w:szCs w:val="24"/>
           <w:rtl w:val="0"/>
         </w:rPr>
-        <w:t xml:space="preserve">I used HTML5 (Hyper Text Markup Language 5) to build the skeleton and main content of each page (AC 1.1). I used tags like &lt;html&gt; and &lt;body&gt; to set the documents up correctly (AC 1.1). For the text, I used &lt;h1&gt; tag for main titles and &lt;p&gt; tag for any paragraphs (AC 1.1). I also used the &lt;a href&gt; tag for links to other pages in my website, in the navigation bar (AC 1.1). I used  the &lt;b&gt; to make key terms bold, “text-align: centre” to centre the navigation bar, &lt;ul&gt;/&lt;ol&gt; for unordered/ordered lists respectively, &lt;section&gt; to separate different parts of each page and &lt;br&gt; to start a new line for some sentences.</w:t>
+        <w:t xml:space="preserve">I used HTML5 (Hyper Text Markup Language 5) to build the skeleton and main content of each page (AC 1.1). I used tags like &lt;html&gt; and &lt;body&gt; to set the documents up correctly (AC 1.1). For the text, I used &lt;h1&gt; tag for main titles and &lt;p&gt; tag for any paragraphs (AC 1.1). I also used the &lt;a href&gt; tag for links to other pages in my website, in the navigation bar (AC 1.1). I used  the &lt;b&gt; to make key terms bold, “text-align: centre” to centre the navigation bar, &lt;ul&gt;/&lt;ol&gt; for unordered/ordered lists respectively, &lt;section&gt; to separate different parts of each page and &lt;br&gt; to start a new line for some sentences (AC 1.2).</w:t>
       </w:r>
     </w:p>
     <w:p>
@@ -658,23 +658,7 @@
           <w:szCs w:val="24"/>
           <w:rtl w:val="0"/>
         </w:rPr>
-        <w:t xml:space="preserve">My first design idea was to use a frame structure where the menu stayed in a fixed box. However, I realised frames were outdated and take up a lot of </w:t>
-      </w:r>
-      <w:r>
-        <w:rPr>
-          <w:sz w:val="24"/>
-          <w:szCs w:val="24"/>
-          <w:rtl w:val="0"/>
-        </w:rPr>
-        <w:t xml:space="preserve">space on the page, </w:t>
-      </w:r>
-      <w:r>
-        <w:rPr>
-          <w:sz w:val="24"/>
-          <w:szCs w:val="24"/>
-          <w:rtl w:val="0"/>
-        </w:rPr>
-        <w:t xml:space="preserve">space that can instead be used for content, so I decided to use a navigation bar instead. This was a more practical choice as it makes it easier for the user to navigate to other pages, it also makes the website feel more practical (AC 2.3).</w:t>
+        <w:t xml:space="preserve">My first design idea was to use a frame structure where the menu stayed in a fixed box. However, I realised frames were outdated and take up a lot of space on the page, space that can instead be used for content, so I decided to use a navigation bar instead. This was a more practical choice as it makes it easier for the user to navigate to other pages, it also makes the website feel more practical (AC 2.3).</w:t>
       </w:r>
     </w:p>
     <w:p>
@@ -706,16 +690,16 @@
           <wp:inline distB="114300" distT="114300" distL="114300" distR="114300">
             <wp:extent cx="3314700" cy="6207499"/>
             <wp:effectExtent b="0" l="0" r="0" t="0"/>
-            <wp:docPr id="7" name="image13.jpg"/>
+            <wp:docPr id="25" name="image14.jpg"/>
             <a:graphic>
               <a:graphicData uri="http://schemas.openxmlformats.org/drawingml/2006/picture">
                 <pic:pic>
                   <pic:nvPicPr>
-                    <pic:cNvPr id="0" name="image13.jpg"/>
+                    <pic:cNvPr id="0" name="image14.jpg"/>
                     <pic:cNvPicPr preferRelativeResize="0"/>
                   </pic:nvPicPr>
                   <pic:blipFill>
-                    <a:blip r:embed="rId18"/>
+                    <a:blip r:embed="rId19"/>
                     <a:srcRect b="0" l="0" r="0" t="0"/>
                     <a:stretch>
                       <a:fillRect/>
@@ -786,16 +770,16 @@
           <wp:inline distB="114300" distT="114300" distL="114300" distR="114300">
             <wp:extent cx="5943600" cy="3022600"/>
             <wp:effectExtent b="0" l="0" r="0" t="0"/>
-            <wp:docPr id="12" name="image6.png"/>
+            <wp:docPr id="27" name="image10.png"/>
             <a:graphic>
               <a:graphicData uri="http://schemas.openxmlformats.org/drawingml/2006/picture">
                 <pic:pic>
                   <pic:nvPicPr>
-                    <pic:cNvPr id="0" name="image6.png"/>
+                    <pic:cNvPr id="0" name="image10.png"/>
                     <pic:cNvPicPr preferRelativeResize="0"/>
                   </pic:nvPicPr>
                   <pic:blipFill>
-                    <a:blip r:embed="rId19"/>
+                    <a:blip r:embed="rId20"/>
                     <a:srcRect b="0" l="0" r="0" t="0"/>
                     <a:stretch>
                       <a:fillRect/>
@@ -870,7 +854,7 @@
           <w:u w:val="single"/>
         </w:rPr>
       </w:pPr>
-      <w:bookmarkStart w:colFirst="0" w:colLast="0" w:name="_cjnxbtnxo98y" w:id="5"/>
+      <w:bookmarkStart w:colFirst="0" w:colLast="0" w:name="_heading=h.vpjbnexrm124" w:id="5"/>
       <w:bookmarkEnd w:id="5"/>
       <w:r>
         <w:rPr>
@@ -932,7 +916,7 @@
           <w:szCs w:val="24"/>
           <w:rtl w:val="0"/>
         </w:rPr>
-        <w:t xml:space="preserve">To meet the requirements for my website, I chose a navigation bar at the top of each page. This ensured that the user could go to any page the same way they could from any website and that any of the 11 pages were easily accessible (AC 2.1). Keeping the layout the same on every page makes it easier for people to focus on the information instead of how to navigate through the website. </w:t>
+        <w:t xml:space="preserve">To meet the requirements for my website, I chose a navigation bar at the top of each page. This ensured that the user could go to any page the same way they could from any website and that any of the 11 pages were easily accessible (AC 2.1). Keeping the layout the same on every page makes it easier for people to focus on the information instead of how to navigate through the website. I built a functional website that had linked web pages (AC 3.1).</w:t>
       </w:r>
     </w:p>
     <w:p>
@@ -1113,7 +1097,7 @@
           <w:u w:val="single"/>
         </w:rPr>
       </w:pPr>
-      <w:bookmarkStart w:colFirst="0" w:colLast="0" w:name="_sjtck0rm9vxa" w:id="6"/>
+      <w:bookmarkStart w:colFirst="0" w:colLast="0" w:name="_heading=h.c0ejcw4nnagy" w:id="6"/>
       <w:bookmarkEnd w:id="6"/>
       <w:r>
         <w:rPr>
@@ -1133,16 +1117,16 @@
           <wp:inline distB="114300" distT="114300" distL="114300" distR="114300">
             <wp:extent cx="5943600" cy="4140200"/>
             <wp:effectExtent b="0" l="0" r="0" t="0"/>
-            <wp:docPr id="11" name="image12.jpg"/>
+            <wp:docPr id="28" name="image3.jpg"/>
             <a:graphic>
               <a:graphicData uri="http://schemas.openxmlformats.org/drawingml/2006/picture">
                 <pic:pic>
                   <pic:nvPicPr>
-                    <pic:cNvPr id="0" name="image12.jpg"/>
+                    <pic:cNvPr id="0" name="image3.jpg"/>
                     <pic:cNvPicPr preferRelativeResize="0"/>
                   </pic:nvPicPr>
                   <pic:blipFill>
-                    <a:blip r:embed="rId20"/>
+                    <a:blip r:embed="rId21"/>
                     <a:srcRect b="0" l="0" r="0" t="0"/>
                     <a:stretch>
                       <a:fillRect/>
@@ -1221,7 +1205,7 @@
           <w:u w:val="single"/>
         </w:rPr>
       </w:pPr>
-      <w:bookmarkStart w:colFirst="0" w:colLast="0" w:name="_hnnt71p2a7r5" w:id="7"/>
+      <w:bookmarkStart w:colFirst="0" w:colLast="0" w:name="_heading=h.vq4qof3ukxyy" w:id="7"/>
       <w:bookmarkEnd w:id="7"/>
       <w:r>
         <w:rPr>
@@ -1296,7 +1280,7 @@
           <w:u w:val="single"/>
         </w:rPr>
       </w:pPr>
-      <w:bookmarkStart w:colFirst="0" w:colLast="0" w:name="_u87yi8nc3n6w" w:id="8"/>
+      <w:bookmarkStart w:colFirst="0" w:colLast="0" w:name="_heading=h.yu24i13oe62c" w:id="8"/>
       <w:bookmarkEnd w:id="8"/>
       <w:r>
         <w:rPr>
@@ -1337,7 +1321,7 @@
         </w:rPr>
         <w:t xml:space="preserve">NASA Global Climate Change - </w:t>
       </w:r>
-      <w:hyperlink r:id="rId21">
+      <w:hyperlink r:id="rId22">
         <w:r>
           <w:rPr>
             <w:color w:val="1155cc"/>
@@ -1357,6 +1341,11 @@
         </w:rPr>
         <w:t xml:space="preserve"> - scientific facts and temperature data.</w:t>
       </w:r>
+      <w:r>
+        <w:rPr>
+          <w:rtl w:val="0"/>
+        </w:rPr>
+      </w:r>
     </w:p>
     <w:p>
       <w:pPr>
@@ -1393,6 +1382,11 @@
         </w:rPr>
         <w:t xml:space="preserve">Wikimedia Commons - main source for public domain images</w:t>
       </w:r>
+      <w:r>
+        <w:rPr>
+          <w:rtl w:val="0"/>
+        </w:rPr>
+      </w:r>
     </w:p>
     <w:p>
       <w:pPr>
@@ -1429,7 +1423,7 @@
         </w:rPr>
         <w:t xml:space="preserve">W3Schools HTML/CSS Tutorials - </w:t>
       </w:r>
-      <w:hyperlink r:id="rId22">
+      <w:hyperlink r:id="rId23">
         <w:r>
           <w:rPr>
             <w:color w:val="1155cc"/>
@@ -1449,6 +1443,11 @@
         </w:rPr>
         <w:t xml:space="preserve"> - main page for basic tutorials e.g. navigation bar</w:t>
       </w:r>
+      <w:r>
+        <w:rPr>
+          <w:rtl w:val="0"/>
+        </w:rPr>
+      </w:r>
     </w:p>
     <w:p>
       <w:pPr>
@@ -1485,7 +1484,7 @@
         </w:rPr>
         <w:t xml:space="preserve">Youtube/Coding Geek - </w:t>
       </w:r>
-      <w:hyperlink r:id="rId23">
+      <w:hyperlink r:id="rId24">
         <w:r>
           <w:rPr>
             <w:color w:val="1155cc"/>
@@ -1504,6 +1503,11 @@
           <w:rtl w:val="0"/>
         </w:rPr>
         <w:t xml:space="preserve"> - video on how to use FormSubmit</w:t>
+      </w:r>
+      <w:r>
+        <w:rPr>
+          <w:rtl w:val="0"/>
+        </w:rPr>
       </w:r>
     </w:p>
     <w:p>
@@ -1793,6 +1797,20 @@
       <w:sz w:val="52"/>
       <w:szCs w:val="52"/>
     </w:rPr>
+  </w:style>
+  <w:style w:type="table" w:styleId="TableNormal" w:default="1">
+    <w:name w:val="TableNormal"/>
+    <w:tblPr>
+      <w:tblCellMar>
+        <w:top w:w="100.0" w:type="dxa"/>
+        <w:left w:w="100.0" w:type="dxa"/>
+        <w:bottom w:w="100.0" w:type="dxa"/>
+        <w:right w:w="100.0" w:type="dxa"/>
+      </w:tblCellMar>
+    </w:tblPr>
+  </w:style>
+  <w:style w:type="paragraph" w:styleId="Normal" w:default="1">
+    <w:name w:val="normal"/>
   </w:style>
   <w:style w:type="paragraph" w:styleId="Subtitle">
     <w:name w:val="Subtitle"/>
@@ -2125,4 +2143,19 @@
   </a:objectDefaults>
   <a:extraClrSchemeLst/>
 </a:theme>
+</file>
+
+<file path=customXML/item1.xml><?xml version="1.0" encoding="utf-8"?>
+<go:gDocsCustomXmlDataStorage xmlns:go="http://customooxmlschemas.google.com/" xmlns:r="http://schemas.openxmlformats.org/officeDocument/2006/relationships" uri="GoogleDocsCustomDataVersion2">
+  <go:docsCustomData xmlns:go="http://customooxmlschemas.google.com/" roundtripDataSignature="AMtx7mhpKiKSs69rAxjJEXh1KcHd4wTiSg==">CgMxLjAyDmguaXEzaXJyaXgxYnVnMg5oLmtiZzB6YTV1eHN2YzIOaC5kdjFiODFlM2Rqa2UyDmgud3Y4eDZwdDM2czVlMg5oLjY3cmpkbXNwMW9wbjIOaC52cGpibmV4cm0xMjQyDmguYzBlamN3NG5uYWd5Mg5oLnZxNHFvZjN1a3h5eTIOaC55dTI0aTEzb2U2MmM4AHIhMWhSQ3ZKT2tyc0J1V0ZheVh5TmRqTXd4ZUVVNGNfcXps</go:docsCustomData>
+</go:gDocsCustomXmlDataStorage>
+</file>
+
+<file path=customXML/itemProps1.xml><?xml version="1.0" encoding="utf-8"?>
+<ds:datastoreItem xmlns:ds="http://schemas.openxmlformats.org/officeDocument/2006/customXml" ds:itemID="{11111111-1234-1234-1234-123412341234}">
+  <ds:schemaRefs>
+    <ds:schemaRef ds:uri="http://schemas.openxmlformats.org/officeDocument/2006/relationships"/>
+    <ds:schemaRef ds:uri="http://customooxmlschemas.google.com/"/>
+  </ds:schemaRefs>
+</ds:datastoreItem>
 </file>
</xml_diff>